<commit_message>
💄 Updating Filter UI
</commit_message>
<xml_diff>
--- a/LEMBAR_SPT.docx
+++ b/LEMBAR_SPT.docx
@@ -51,13 +51,33 @@
           <w:lang w:val="en-US"/>
         </w:rPr>
       </w:pPr>
+      <w:proofErr w:type="spellStart"/>
+      <w:proofErr w:type="gramStart"/>
       <w:r>
         <w:rPr>
           <w:sz w:val="20"/>
           <w:szCs w:val="20"/>
           <w:lang w:val="en-US"/>
         </w:rPr>
-        <w:t>Nomor : 800.1.11.1/               /ADPIM</w:t>
+        <w:t>Nomor</w:t>
+      </w:r>
+      <w:proofErr w:type="spellEnd"/>
+      <w:r>
+        <w:rPr>
+          <w:sz w:val="20"/>
+          <w:szCs w:val="20"/>
+          <w:lang w:val="en-US"/>
+        </w:rPr>
+        <w:t xml:space="preserve"> :</w:t>
+      </w:r>
+      <w:proofErr w:type="gramEnd"/>
+      <w:r>
+        <w:rPr>
+          <w:sz w:val="20"/>
+          <w:szCs w:val="20"/>
+          <w:lang w:val="en-US"/>
+        </w:rPr>
+        <w:t xml:space="preserve"> 800.1.11.1/               /ADPIM</w:t>
       </w:r>
     </w:p>
     <w:tbl>
@@ -92,6 +112,7 @@
                 <w:lang w:val="en-US"/>
               </w:rPr>
             </w:pPr>
+            <w:proofErr w:type="gramStart"/>
             <w:r>
               <w:rPr>
                 <w:sz w:val="20"/>
@@ -100,6 +121,7 @@
               </w:rPr>
               <w:t>Dasar :</w:t>
             </w:r>
+            <w:proofErr w:type="gramEnd"/>
           </w:p>
         </w:tc>
         <w:tc>
@@ -187,13 +209,23 @@
                 <w:lang w:val="en-US"/>
               </w:rPr>
             </w:pPr>
+            <w:proofErr w:type="spellStart"/>
             <w:r>
               <w:rPr>
                 <w:rFonts w:asciiTheme="majorBidi" w:eastAsia="Tahoma" w:hAnsiTheme="majorBidi" w:cstheme="majorBidi"/>
                 <w:sz w:val="20"/>
                 <w:szCs w:val="20"/>
               </w:rPr>
-              <w:t xml:space="preserve">Tanggal </w:t>
+              <w:t>Tanggal</w:t>
+            </w:r>
+            <w:proofErr w:type="spellEnd"/>
+            <w:r>
+              <w:rPr>
+                <w:rFonts w:asciiTheme="majorBidi" w:eastAsia="Tahoma" w:hAnsiTheme="majorBidi" w:cstheme="majorBidi"/>
+                <w:sz w:val="20"/>
+                <w:szCs w:val="20"/>
+              </w:rPr>
+              <w:t xml:space="preserve"> </w:t>
             </w:r>
             <w:r>
               <w:rPr>
@@ -201,7 +233,43 @@
                 <w:sz w:val="20"/>
                 <w:szCs w:val="20"/>
               </w:rPr>
-              <w:t>{assignments – date (dikurangi 1 hari)}</w:t>
+              <w:t>{assignments – date (</w:t>
+            </w:r>
+            <w:proofErr w:type="spellStart"/>
+            <w:r>
+              <w:rPr>
+                <w:rFonts w:asciiTheme="majorBidi" w:eastAsia="Tahoma" w:hAnsiTheme="majorBidi" w:cstheme="majorBidi"/>
+                <w:sz w:val="20"/>
+                <w:szCs w:val="20"/>
+              </w:rPr>
+              <w:t>dikurangi</w:t>
+            </w:r>
+            <w:proofErr w:type="spellEnd"/>
+            <w:r>
+              <w:rPr>
+                <w:rFonts w:asciiTheme="majorBidi" w:eastAsia="Tahoma" w:hAnsiTheme="majorBidi" w:cstheme="majorBidi"/>
+                <w:sz w:val="20"/>
+                <w:szCs w:val="20"/>
+              </w:rPr>
+              <w:t xml:space="preserve"> 1 </w:t>
+            </w:r>
+            <w:proofErr w:type="spellStart"/>
+            <w:r>
+              <w:rPr>
+                <w:rFonts w:asciiTheme="majorBidi" w:eastAsia="Tahoma" w:hAnsiTheme="majorBidi" w:cstheme="majorBidi"/>
+                <w:sz w:val="20"/>
+                <w:szCs w:val="20"/>
+              </w:rPr>
+              <w:t>hari</w:t>
+            </w:r>
+            <w:proofErr w:type="spellEnd"/>
+            <w:r>
+              <w:rPr>
+                <w:rFonts w:asciiTheme="majorBidi" w:eastAsia="Tahoma" w:hAnsiTheme="majorBidi" w:cstheme="majorBidi"/>
+                <w:sz w:val="20"/>
+                <w:szCs w:val="20"/>
+              </w:rPr>
+              <w:t>)}</w:t>
             </w:r>
             <w:r>
               <w:rPr>
@@ -638,13 +706,24 @@
           <w:szCs w:val="20"/>
         </w:rPr>
       </w:pPr>
-      <w:r>
-        <w:rPr>
-          <w:sz w:val="20"/>
-          <w:szCs w:val="20"/>
-        </w:rPr>
-        <w:t>Untuk :</w:t>
-      </w:r>
+      <w:proofErr w:type="spellStart"/>
+      <w:proofErr w:type="gramStart"/>
+      <w:r>
+        <w:rPr>
+          <w:sz w:val="20"/>
+          <w:szCs w:val="20"/>
+        </w:rPr>
+        <w:t>Untuk</w:t>
+      </w:r>
+      <w:proofErr w:type="spellEnd"/>
+      <w:r>
+        <w:rPr>
+          <w:sz w:val="20"/>
+          <w:szCs w:val="20"/>
+        </w:rPr>
+        <w:t xml:space="preserve"> :</w:t>
+      </w:r>
+      <w:proofErr w:type="gramEnd"/>
     </w:p>
     <w:p>
       <w:pPr>
@@ -660,48 +739,258 @@
         </w:rPr>
       </w:pPr>
       <w:bookmarkStart w:id="0" w:name="OLE_LINK1"/>
-      <w:r>
-        <w:rPr>
-          <w:sz w:val="20"/>
-          <w:szCs w:val="20"/>
-        </w:rPr>
-        <w:t xml:space="preserve">Melakukan Koordinasi/Pendokumentasian Kegiatan </w:t>
-      </w:r>
-      <w:r>
-        <w:rPr>
-          <w:sz w:val="20"/>
-          <w:szCs w:val="20"/>
-        </w:rPr>
-        <w:t xml:space="preserve">{attendeds – rank + ”Kalsel, ”} </w:t>
-      </w:r>
-      <w:r>
-        <w:rPr>
-          <w:sz w:val="20"/>
-          <w:szCs w:val="20"/>
-        </w:rPr>
-        <w:t>dalam rangka</w:t>
+      <w:proofErr w:type="spellStart"/>
+      <w:r>
+        <w:rPr>
+          <w:sz w:val="20"/>
+          <w:szCs w:val="20"/>
+        </w:rPr>
+        <w:t>Melakukan</w:t>
+      </w:r>
+      <w:proofErr w:type="spellEnd"/>
+      <w:r>
+        <w:rPr>
+          <w:sz w:val="20"/>
+          <w:szCs w:val="20"/>
+        </w:rPr>
+        <w:t xml:space="preserve"> </w:t>
+      </w:r>
+      <w:proofErr w:type="spellStart"/>
+      <w:r>
+        <w:rPr>
+          <w:sz w:val="20"/>
+          <w:szCs w:val="20"/>
+        </w:rPr>
+        <w:t>Koordinasi</w:t>
+      </w:r>
+      <w:proofErr w:type="spellEnd"/>
+      <w:r>
+        <w:rPr>
+          <w:sz w:val="20"/>
+          <w:szCs w:val="20"/>
+        </w:rPr>
+        <w:t>/</w:t>
+      </w:r>
+      <w:proofErr w:type="spellStart"/>
+      <w:r>
+        <w:rPr>
+          <w:sz w:val="20"/>
+          <w:szCs w:val="20"/>
+        </w:rPr>
+        <w:t>Pendokumentasian</w:t>
+      </w:r>
+      <w:proofErr w:type="spellEnd"/>
+      <w:r>
+        <w:rPr>
+          <w:sz w:val="20"/>
+          <w:szCs w:val="20"/>
+        </w:rPr>
+        <w:t xml:space="preserve"> </w:t>
+      </w:r>
+      <w:proofErr w:type="spellStart"/>
+      <w:r>
+        <w:rPr>
+          <w:sz w:val="20"/>
+          <w:szCs w:val="20"/>
+        </w:rPr>
+        <w:t>Kegiatan</w:t>
+      </w:r>
+      <w:proofErr w:type="spellEnd"/>
+      <w:r>
+        <w:rPr>
+          <w:sz w:val="20"/>
+          <w:szCs w:val="20"/>
+        </w:rPr>
+        <w:t xml:space="preserve"> </w:t>
+      </w:r>
+      <w:r>
+        <w:rPr>
+          <w:sz w:val="20"/>
+          <w:szCs w:val="20"/>
+        </w:rPr>
+        <w:t>{</w:t>
+      </w:r>
+      <w:proofErr w:type="spellStart"/>
+      <w:r>
+        <w:rPr>
+          <w:sz w:val="20"/>
+          <w:szCs w:val="20"/>
+        </w:rPr>
+        <w:t>attendeds</w:t>
+      </w:r>
+      <w:proofErr w:type="spellEnd"/>
+      <w:r>
+        <w:rPr>
+          <w:sz w:val="20"/>
+          <w:szCs w:val="20"/>
+        </w:rPr>
+        <w:t xml:space="preserve"> – rank </w:t>
+      </w:r>
+      <w:proofErr w:type="gramStart"/>
+      <w:r>
+        <w:rPr>
+          <w:sz w:val="20"/>
+          <w:szCs w:val="20"/>
+        </w:rPr>
+        <w:t>+ ”</w:t>
+      </w:r>
+      <w:proofErr w:type="spellStart"/>
+      <w:r>
+        <w:rPr>
+          <w:sz w:val="20"/>
+          <w:szCs w:val="20"/>
+        </w:rPr>
+        <w:t>Kalsel</w:t>
+      </w:r>
+      <w:proofErr w:type="spellEnd"/>
+      <w:r>
+        <w:rPr>
+          <w:sz w:val="20"/>
+          <w:szCs w:val="20"/>
+        </w:rPr>
+        <w:t>, ”</w:t>
+      </w:r>
+      <w:proofErr w:type="gramEnd"/>
+      <w:r>
+        <w:rPr>
+          <w:sz w:val="20"/>
+          <w:szCs w:val="20"/>
+        </w:rPr>
+        <w:t xml:space="preserve">} </w:t>
+      </w:r>
+      <w:proofErr w:type="spellStart"/>
+      <w:r>
+        <w:rPr>
+          <w:sz w:val="20"/>
+          <w:szCs w:val="20"/>
+        </w:rPr>
+        <w:t>dalam</w:t>
+      </w:r>
+      <w:proofErr w:type="spellEnd"/>
+      <w:r>
+        <w:rPr>
+          <w:sz w:val="20"/>
+          <w:szCs w:val="20"/>
+        </w:rPr>
+        <w:t xml:space="preserve"> </w:t>
+      </w:r>
+      <w:proofErr w:type="spellStart"/>
+      <w:r>
+        <w:rPr>
+          <w:sz w:val="20"/>
+          <w:szCs w:val="20"/>
+        </w:rPr>
+        <w:t>rangka</w:t>
       </w:r>
       <w:bookmarkEnd w:id="0"/>
-      <w:r>
-        <w:rPr>
-          <w:sz w:val="20"/>
-          <w:szCs w:val="20"/>
-        </w:rPr>
-        <w:t xml:space="preserve"> Kegiatan {assignments - title}, Tanggal {assignments - date}</w:t>
-      </w:r>
-      <w:r>
-        <w:rPr>
-          <w:sz w:val="20"/>
-          <w:szCs w:val="20"/>
-        </w:rPr>
-        <w:t xml:space="preserve"> s/d {assignments – date} + {assignments – day_count - 1}</w:t>
-      </w:r>
-      <w:r>
-        <w:rPr>
-          <w:sz w:val="20"/>
-          <w:szCs w:val="20"/>
-        </w:rPr>
-        <w:t xml:space="preserve"> di {assignments – location_detail}, {assignments - location}.</w:t>
+      <w:proofErr w:type="spellEnd"/>
+      <w:r>
+        <w:rPr>
+          <w:sz w:val="20"/>
+          <w:szCs w:val="20"/>
+        </w:rPr>
+        <w:t xml:space="preserve"> </w:t>
+      </w:r>
+      <w:proofErr w:type="spellStart"/>
+      <w:r>
+        <w:rPr>
+          <w:sz w:val="20"/>
+          <w:szCs w:val="20"/>
+        </w:rPr>
+        <w:t>Kegiatan</w:t>
+      </w:r>
+      <w:proofErr w:type="spellEnd"/>
+      <w:r>
+        <w:rPr>
+          <w:sz w:val="20"/>
+          <w:szCs w:val="20"/>
+        </w:rPr>
+        <w:t xml:space="preserve"> {assignments - title}, </w:t>
+      </w:r>
+      <w:proofErr w:type="spellStart"/>
+      <w:r>
+        <w:rPr>
+          <w:sz w:val="20"/>
+          <w:szCs w:val="20"/>
+        </w:rPr>
+        <w:t>Tanggal</w:t>
+      </w:r>
+      <w:proofErr w:type="spellEnd"/>
+      <w:r>
+        <w:rPr>
+          <w:sz w:val="20"/>
+          <w:szCs w:val="20"/>
+        </w:rPr>
+        <w:t xml:space="preserve"> {assignments - date}</w:t>
+      </w:r>
+      <w:r>
+        <w:rPr>
+          <w:sz w:val="20"/>
+          <w:szCs w:val="20"/>
+        </w:rPr>
+        <w:t xml:space="preserve"> s/d {assignments – date} + {assignments – </w:t>
+      </w:r>
+      <w:proofErr w:type="spellStart"/>
+      <w:r>
+        <w:rPr>
+          <w:sz w:val="20"/>
+          <w:szCs w:val="20"/>
+        </w:rPr>
+        <w:t>day_count</w:t>
+      </w:r>
+      <w:proofErr w:type="spellEnd"/>
+      <w:r>
+        <w:rPr>
+          <w:sz w:val="20"/>
+          <w:szCs w:val="20"/>
+        </w:rPr>
+        <w:t xml:space="preserve"> - 1}</w:t>
+      </w:r>
+      <w:r>
+        <w:rPr>
+          <w:sz w:val="20"/>
+          <w:szCs w:val="20"/>
+        </w:rPr>
+        <w:t xml:space="preserve"> {years - </w:t>
+      </w:r>
+      <w:proofErr w:type="gramStart"/>
+      <w:r>
+        <w:rPr>
+          <w:sz w:val="20"/>
+          <w:szCs w:val="20"/>
+        </w:rPr>
+        <w:t>now(</w:t>
+      </w:r>
+      <w:proofErr w:type="gramEnd"/>
+      <w:r>
+        <w:rPr>
+          <w:sz w:val="20"/>
+          <w:szCs w:val="20"/>
+        </w:rPr>
+        <w:t>)}</w:t>
+      </w:r>
+      <w:r>
+        <w:rPr>
+          <w:sz w:val="20"/>
+          <w:szCs w:val="20"/>
+        </w:rPr>
+        <w:t xml:space="preserve"> di {assignments – </w:t>
+      </w:r>
+      <w:proofErr w:type="spellStart"/>
+      <w:r>
+        <w:rPr>
+          <w:sz w:val="20"/>
+          <w:szCs w:val="20"/>
+        </w:rPr>
+        <w:t>location_detail</w:t>
+      </w:r>
+      <w:proofErr w:type="spellEnd"/>
+      <w:r>
+        <w:rPr>
+          <w:sz w:val="20"/>
+          <w:szCs w:val="20"/>
+        </w:rPr>
+        <w:t>}, {assignments - location}.</w:t>
       </w:r>
     </w:p>
     <w:p>

</xml_diff>